<commit_message>
Tighten companies list filter; restore wire feeds that work from Vercel
</commit_message>
<xml_diff>
--- a/delivery/Companies_Identified_List.docx
+++ b/delivery/Companies_Identified_List.docx
@@ -3445,7 +3445,7 @@
                 <w:sz w:val="18"/>
                 <w:szCs w:val="18"/>
               </w:rPr>
-              <w:t xml:space="preserve">Infrastructure projects</w:t>
+              <w:t xml:space="preserve">ElGoat</w:t>
             </w:r>
           </w:p>
         </w:tc>
@@ -3480,7 +3480,7 @@
                 <w:sz w:val="18"/>
                 <w:szCs w:val="18"/>
               </w:rPr>
-              <w:t xml:space="preserve">Logistics, Real Estate, Energy</w:t>
+              <w:t xml:space="preserve">Logistics</w:t>
             </w:r>
           </w:p>
         </w:tc>
@@ -3515,7 +3515,7 @@
                 <w:sz w:val="18"/>
                 <w:szCs w:val="18"/>
               </w:rPr>
-              <w:t xml:space="preserve">United Arab Emirates</w:t>
+              <w:t xml:space="preserve">Saudi Arabia</w:t>
             </w:r>
           </w:p>
         </w:tc>
@@ -3550,7 +3550,7 @@
                 <w:sz w:val="18"/>
                 <w:szCs w:val="18"/>
               </w:rPr>
-              <w:t xml:space="preserve">49</w:t>
+              <w:t xml:space="preserve">47</w:t>
             </w:r>
           </w:p>
         </w:tc>
@@ -3657,7 +3657,7 @@
                 <w:sz w:val="18"/>
                 <w:szCs w:val="18"/>
               </w:rPr>
-              <w:t xml:space="preserve">ElGoat</w:t>
+              <w:t xml:space="preserve">Frimex</w:t>
             </w:r>
           </w:p>
         </w:tc>
@@ -3692,7 +3692,7 @@
                 <w:sz w:val="18"/>
                 <w:szCs w:val="18"/>
               </w:rPr>
-              <w:t xml:space="preserve">Logistics</w:t>
+              <w:t xml:space="preserve">Healthcare, Logistics, Energy</w:t>
             </w:r>
           </w:p>
         </w:tc>
@@ -3727,7 +3727,7 @@
                 <w:sz w:val="18"/>
                 <w:szCs w:val="18"/>
               </w:rPr>
-              <w:t xml:space="preserve">Saudi Arabia</w:t>
+              <w:t xml:space="preserve">Riyadh, Saudi Arabia</w:t>
             </w:r>
           </w:p>
         </w:tc>
@@ -3870,7 +3870,7 @@
                 <w:sz w:val="18"/>
                 <w:szCs w:val="18"/>
               </w:rPr>
-              <w:t xml:space="preserve">Frimex</w:t>
+              <w:t xml:space="preserve">Maison Safqa</w:t>
             </w:r>
           </w:p>
         </w:tc>
@@ -3905,7 +3905,7 @@
                 <w:sz w:val="18"/>
                 <w:szCs w:val="18"/>
               </w:rPr>
-              <w:t xml:space="preserve">Healthcare, Logistics, Energy</w:t>
+              <w:t xml:space="preserve">Logistics, E-commerce</w:t>
             </w:r>
           </w:p>
         </w:tc>
@@ -3953,219 +3953,6 @@
               <w:bottom w:val="single" w:color="D5D3C8" w:sz="4"/>
               <w:right w:val="single" w:color="D5D3C8" w:sz="4"/>
             </w:tcBorders>
-            <w:tcMar>
-              <w:top w:type="dxa" w:w="80"/>
-              <w:left w:type="dxa" w:w="120"/>
-              <w:bottom w:type="dxa" w:w="80"/>
-              <w:right w:type="dxa" w:w="120"/>
-            </w:tcMar>
-            <w:vAlign w:val="top"/>
-          </w:tcPr>
-          <w:p>
-            <w:pPr>
-              <w:spacing w:after="0"/>
-              <w:jc w:val="center"/>
-            </w:pPr>
-            <w:r>
-              <w:rPr>
-                <w:rFonts w:ascii="Calibri" w:cs="Calibri" w:eastAsia="Calibri" w:hAnsi="Calibri"/>
-                <w:b w:val="false"/>
-                <w:bCs w:val="false"/>
-                <w:color w:val="2A2E3A"/>
-                <w:sz w:val="18"/>
-                <w:szCs w:val="18"/>
-              </w:rPr>
-              <w:t xml:space="preserve">47</w:t>
-            </w:r>
-          </w:p>
-        </w:tc>
-        <w:tc>
-          <w:tcPr>
-            <w:tcW w:type="dxa" w:w="1160"/>
-            <w:tcBorders>
-              <w:top w:val="single" w:color="D5D3C8" w:sz="4"/>
-              <w:left w:val="single" w:color="D5D3C8" w:sz="4"/>
-              <w:bottom w:val="single" w:color="D5D3C8" w:sz="4"/>
-              <w:right w:val="single" w:color="D5D3C8" w:sz="4"/>
-            </w:tcBorders>
-            <w:tcMar>
-              <w:top w:type="dxa" w:w="80"/>
-              <w:left w:type="dxa" w:w="120"/>
-              <w:bottom w:type="dxa" w:w="80"/>
-              <w:right w:type="dxa" w:w="120"/>
-            </w:tcMar>
-            <w:vAlign w:val="top"/>
-          </w:tcPr>
-          <w:p>
-            <w:pPr>
-              <w:spacing w:after="0"/>
-              <w:jc w:val="center"/>
-            </w:pPr>
-            <w:r>
-              <w:rPr>
-                <w:rFonts w:ascii="Calibri" w:cs="Calibri" w:eastAsia="Calibri" w:hAnsi="Calibri"/>
-                <w:b w:val="false"/>
-                <w:bCs w:val="false"/>
-                <w:color w:val="2A2E3A"/>
-                <w:sz w:val="18"/>
-                <w:szCs w:val="18"/>
-              </w:rPr>
-              <w:t xml:space="preserve">1</w:t>
-            </w:r>
-          </w:p>
-        </w:tc>
-      </w:tr>
-      <w:tr>
-        <w:tc>
-          <w:tcPr>
-            <w:tcW w:type="dxa" w:w="600"/>
-            <w:tcBorders>
-              <w:top w:val="single" w:color="D5D3C8" w:sz="4"/>
-              <w:left w:val="single" w:color="D5D3C8" w:sz="4"/>
-              <w:bottom w:val="single" w:color="D5D3C8" w:sz="4"/>
-              <w:right w:val="single" w:color="D5D3C8" w:sz="4"/>
-            </w:tcBorders>
-            <w:tcMar>
-              <w:top w:type="dxa" w:w="80"/>
-              <w:left w:type="dxa" w:w="120"/>
-              <w:bottom w:type="dxa" w:w="80"/>
-              <w:right w:type="dxa" w:w="120"/>
-            </w:tcMar>
-            <w:vAlign w:val="top"/>
-          </w:tcPr>
-          <w:p>
-            <w:pPr>
-              <w:spacing w:after="0"/>
-              <w:jc w:val="center"/>
-            </w:pPr>
-            <w:r>
-              <w:rPr>
-                <w:rFonts w:ascii="Calibri" w:cs="Calibri" w:eastAsia="Calibri" w:hAnsi="Calibri"/>
-                <w:b w:val="false"/>
-                <w:bCs w:val="false"/>
-                <w:color w:val="2A2E3A"/>
-                <w:sz w:val="18"/>
-                <w:szCs w:val="18"/>
-              </w:rPr>
-              <w:t xml:space="preserve">18</w:t>
-            </w:r>
-          </w:p>
-        </w:tc>
-        <w:tc>
-          <w:tcPr>
-            <w:tcW w:type="dxa" w:w="2600"/>
-            <w:tcBorders>
-              <w:top w:val="single" w:color="D5D3C8" w:sz="4"/>
-              <w:left w:val="single" w:color="D5D3C8" w:sz="4"/>
-              <w:bottom w:val="single" w:color="D5D3C8" w:sz="4"/>
-              <w:right w:val="single" w:color="D5D3C8" w:sz="4"/>
-            </w:tcBorders>
-            <w:tcMar>
-              <w:top w:type="dxa" w:w="80"/>
-              <w:left w:type="dxa" w:w="120"/>
-              <w:bottom w:type="dxa" w:w="80"/>
-              <w:right w:type="dxa" w:w="120"/>
-            </w:tcMar>
-            <w:vAlign w:val="top"/>
-          </w:tcPr>
-          <w:p>
-            <w:pPr>
-              <w:spacing w:after="0"/>
-              <w:jc w:val="left"/>
-            </w:pPr>
-            <w:r>
-              <w:rPr>
-                <w:rFonts w:ascii="Calibri" w:cs="Calibri" w:eastAsia="Calibri" w:hAnsi="Calibri"/>
-                <w:b/>
-                <w:bCs/>
-                <w:color w:val="2A2E3A"/>
-                <w:sz w:val="18"/>
-                <w:szCs w:val="18"/>
-              </w:rPr>
-              <w:t xml:space="preserve">Maison Safqa</w:t>
-            </w:r>
-          </w:p>
-        </w:tc>
-        <w:tc>
-          <w:tcPr>
-            <w:tcW w:type="dxa" w:w="2000"/>
-            <w:tcBorders>
-              <w:top w:val="single" w:color="D5D3C8" w:sz="4"/>
-              <w:left w:val="single" w:color="D5D3C8" w:sz="4"/>
-              <w:bottom w:val="single" w:color="D5D3C8" w:sz="4"/>
-              <w:right w:val="single" w:color="D5D3C8" w:sz="4"/>
-            </w:tcBorders>
-            <w:tcMar>
-              <w:top w:type="dxa" w:w="80"/>
-              <w:left w:type="dxa" w:w="120"/>
-              <w:bottom w:type="dxa" w:w="80"/>
-              <w:right w:type="dxa" w:w="120"/>
-            </w:tcMar>
-            <w:vAlign w:val="top"/>
-          </w:tcPr>
-          <w:p>
-            <w:pPr>
-              <w:spacing w:after="0"/>
-              <w:jc w:val="left"/>
-            </w:pPr>
-            <w:r>
-              <w:rPr>
-                <w:rFonts w:ascii="Calibri" w:cs="Calibri" w:eastAsia="Calibri" w:hAnsi="Calibri"/>
-                <w:b w:val="false"/>
-                <w:bCs w:val="false"/>
-                <w:color w:val="2A2E3A"/>
-                <w:sz w:val="18"/>
-                <w:szCs w:val="18"/>
-              </w:rPr>
-              <w:t xml:space="preserve">Logistics, E-commerce</w:t>
-            </w:r>
-          </w:p>
-        </w:tc>
-        <w:tc>
-          <w:tcPr>
-            <w:tcW w:type="dxa" w:w="1800"/>
-            <w:tcBorders>
-              <w:top w:val="single" w:color="D5D3C8" w:sz="4"/>
-              <w:left w:val="single" w:color="D5D3C8" w:sz="4"/>
-              <w:bottom w:val="single" w:color="D5D3C8" w:sz="4"/>
-              <w:right w:val="single" w:color="D5D3C8" w:sz="4"/>
-            </w:tcBorders>
-            <w:tcMar>
-              <w:top w:type="dxa" w:w="80"/>
-              <w:left w:type="dxa" w:w="120"/>
-              <w:bottom w:type="dxa" w:w="80"/>
-              <w:right w:type="dxa" w:w="120"/>
-            </w:tcMar>
-            <w:vAlign w:val="top"/>
-          </w:tcPr>
-          <w:p>
-            <w:pPr>
-              <w:spacing w:after="0"/>
-              <w:jc w:val="left"/>
-            </w:pPr>
-            <w:r>
-              <w:rPr>
-                <w:rFonts w:ascii="Calibri" w:cs="Calibri" w:eastAsia="Calibri" w:hAnsi="Calibri"/>
-                <w:b w:val="false"/>
-                <w:bCs w:val="false"/>
-                <w:color w:val="2A2E3A"/>
-                <w:sz w:val="18"/>
-                <w:szCs w:val="18"/>
-              </w:rPr>
-              <w:t xml:space="preserve">Riyadh, Saudi Arabia</w:t>
-            </w:r>
-          </w:p>
-        </w:tc>
-        <w:tc>
-          <w:tcPr>
-            <w:tcW w:type="dxa" w:w="1200"/>
-            <w:tcBorders>
-              <w:top w:val="single" w:color="D5D3C8" w:sz="4"/>
-              <w:left w:val="single" w:color="D5D3C8" w:sz="4"/>
-              <w:bottom w:val="single" w:color="D5D3C8" w:sz="4"/>
-              <w:right w:val="single" w:color="D5D3C8" w:sz="4"/>
-            </w:tcBorders>
-            <w:shd w:fill="F8F6EF" w:color="auto" w:val="clear"/>
             <w:tcMar>
               <w:top w:type="dxa" w:w="80"/>
               <w:left w:type="dxa" w:w="120"/>
@@ -6547,7 +6334,7 @@
                 <w:sz w:val="18"/>
                 <w:szCs w:val="18"/>
               </w:rPr>
-              <w:t xml:space="preserve">GlobeNewswire · Public Companies</w:t>
+              <w:t xml:space="preserve">GlobeNewswire · Public Company News</w:t>
             </w:r>
           </w:p>
           <w:p>
@@ -7701,7 +7488,7 @@
                 <w:sz w:val="18"/>
                 <w:szCs w:val="18"/>
               </w:rPr>
-              <w:t xml:space="preserve">GlobeNewswire · Public Companies</w:t>
+              <w:t xml:space="preserve">GlobeNewswire · Public Company News</w:t>
             </w:r>
           </w:p>
           <w:p>
@@ -8278,7 +8065,7 @@
                 <w:sz w:val="18"/>
                 <w:szCs w:val="18"/>
               </w:rPr>
-              <w:t xml:space="preserve">GlobeNewswire · Public Companies</w:t>
+              <w:t xml:space="preserve">GlobeNewswire · Public Company News</w:t>
             </w:r>
           </w:p>
           <w:p>
@@ -8855,7 +8642,7 @@
                 <w:sz w:val="18"/>
                 <w:szCs w:val="18"/>
               </w:rPr>
-              <w:t xml:space="preserve">GlobeNewswire · Public Companies</w:t>
+              <w:t xml:space="preserve">GlobeNewswire · Public Company News</w:t>
             </w:r>
           </w:p>
           <w:p>
@@ -12355,584 +12142,7 @@
           <w:sz w:val="24"/>
           <w:szCs w:val="24"/>
         </w:rPr>
-        <w:t xml:space="preserve">15. Infrastructure projects</w:t>
-      </w:r>
-    </w:p>
-    <w:tbl>
-      <w:tblPr>
-        <w:tblW w:type="dxa" w:w="9360"/>
-        <w:tblBorders>
-          <w:top w:val="single" w:color="auto" w:sz="4"/>
-          <w:left w:val="single" w:color="auto" w:sz="4"/>
-          <w:bottom w:val="single" w:color="auto" w:sz="4"/>
-          <w:right w:val="single" w:color="auto" w:sz="4"/>
-          <w:insideH w:val="single" w:color="auto" w:sz="4"/>
-          <w:insideV w:val="single" w:color="auto" w:sz="4"/>
-        </w:tblBorders>
-      </w:tblPr>
-      <w:tblGrid>
-        <w:gridCol w:w="2340"/>
-        <w:gridCol w:w="2340"/>
-        <w:gridCol w:w="2340"/>
-        <w:gridCol w:w="2340"/>
-      </w:tblGrid>
-      <w:tr>
-        <w:tc>
-          <w:tcPr>
-            <w:tcW w:type="dxa" w:w="2340"/>
-            <w:tcBorders>
-              <w:top w:val="single" w:color="D5D3C8" w:sz="4"/>
-              <w:left w:val="single" w:color="D5D3C8" w:sz="4"/>
-              <w:bottom w:val="single" w:color="D5D3C8" w:sz="4"/>
-              <w:right w:val="single" w:color="D5D3C8" w:sz="4"/>
-            </w:tcBorders>
-            <w:shd w:fill="F8F6EF" w:color="auto" w:val="clear"/>
-            <w:tcMar>
-              <w:top w:type="dxa" w:w="80"/>
-              <w:left w:type="dxa" w:w="120"/>
-              <w:bottom w:type="dxa" w:w="80"/>
-              <w:right w:type="dxa" w:w="120"/>
-            </w:tcMar>
-            <w:vAlign w:val="top"/>
-          </w:tcPr>
-          <w:p>
-            <w:pPr>
-              <w:spacing w:after="0"/>
-              <w:jc w:val="center"/>
-            </w:pPr>
-            <w:r>
-              <w:rPr>
-                <w:rFonts w:ascii="Calibri" w:cs="Calibri" w:eastAsia="Calibri" w:hAnsi="Calibri"/>
-                <w:b/>
-                <w:bCs/>
-                <w:color w:val="2A2E3A"/>
-                <w:sz w:val="18"/>
-                <w:szCs w:val="18"/>
-              </w:rPr>
-              <w:t xml:space="preserve">Composite: 49</w:t>
-            </w:r>
-          </w:p>
-        </w:tc>
-        <w:tc>
-          <w:tcPr>
-            <w:tcW w:type="dxa" w:w="2340"/>
-            <w:tcBorders>
-              <w:top w:val="single" w:color="D5D3C8" w:sz="4"/>
-              <w:left w:val="single" w:color="D5D3C8" w:sz="4"/>
-              <w:bottom w:val="single" w:color="D5D3C8" w:sz="4"/>
-              <w:right w:val="single" w:color="D5D3C8" w:sz="4"/>
-            </w:tcBorders>
-            <w:shd w:fill="F8F6EF" w:color="auto" w:val="clear"/>
-            <w:tcMar>
-              <w:top w:type="dxa" w:w="80"/>
-              <w:left w:type="dxa" w:w="120"/>
-              <w:bottom w:type="dxa" w:w="80"/>
-              <w:right w:type="dxa" w:w="120"/>
-            </w:tcMar>
-            <w:vAlign w:val="top"/>
-          </w:tcPr>
-          <w:p>
-            <w:pPr>
-              <w:spacing w:after="0"/>
-              <w:jc w:val="center"/>
-            </w:pPr>
-            <w:r>
-              <w:rPr>
-                <w:rFonts w:ascii="Calibri" w:cs="Calibri" w:eastAsia="Calibri" w:hAnsi="Calibri"/>
-                <w:b w:val="false"/>
-                <w:bCs w:val="false"/>
-                <w:color w:val="2A2E3A"/>
-                <w:sz w:val="18"/>
-                <w:szCs w:val="18"/>
-              </w:rPr>
-              <w:t xml:space="preserve">Investability: 40</w:t>
-            </w:r>
-          </w:p>
-        </w:tc>
-        <w:tc>
-          <w:tcPr>
-            <w:tcW w:type="dxa" w:w="2340"/>
-            <w:tcBorders>
-              <w:top w:val="single" w:color="D5D3C8" w:sz="4"/>
-              <w:left w:val="single" w:color="D5D3C8" w:sz="4"/>
-              <w:bottom w:val="single" w:color="D5D3C8" w:sz="4"/>
-              <w:right w:val="single" w:color="D5D3C8" w:sz="4"/>
-            </w:tcBorders>
-            <w:shd w:fill="F8F6EF" w:color="auto" w:val="clear"/>
-            <w:tcMar>
-              <w:top w:type="dxa" w:w="80"/>
-              <w:left w:type="dxa" w:w="120"/>
-              <w:bottom w:type="dxa" w:w="80"/>
-              <w:right w:type="dxa" w:w="120"/>
-            </w:tcMar>
-            <w:vAlign w:val="top"/>
-          </w:tcPr>
-          <w:p>
-            <w:pPr>
-              <w:spacing w:after="0"/>
-              <w:jc w:val="center"/>
-            </w:pPr>
-            <w:r>
-              <w:rPr>
-                <w:rFonts w:ascii="Calibri" w:cs="Calibri" w:eastAsia="Calibri" w:hAnsi="Calibri"/>
-                <w:b w:val="false"/>
-                <w:bCs w:val="false"/>
-                <w:color w:val="2A2E3A"/>
-                <w:sz w:val="18"/>
-                <w:szCs w:val="18"/>
-              </w:rPr>
-              <w:t xml:space="preserve">UAE alignment: 58</w:t>
-            </w:r>
-          </w:p>
-        </w:tc>
-        <w:tc>
-          <w:tcPr>
-            <w:tcW w:type="dxa" w:w="2340"/>
-            <w:tcBorders>
-              <w:top w:val="single" w:color="D5D3C8" w:sz="4"/>
-              <w:left w:val="single" w:color="D5D3C8" w:sz="4"/>
-              <w:bottom w:val="single" w:color="D5D3C8" w:sz="4"/>
-              <w:right w:val="single" w:color="D5D3C8" w:sz="4"/>
-            </w:tcBorders>
-            <w:shd w:fill="F8F6EF" w:color="auto" w:val="clear"/>
-            <w:tcMar>
-              <w:top w:type="dxa" w:w="80"/>
-              <w:left w:type="dxa" w:w="120"/>
-              <w:bottom w:type="dxa" w:w="80"/>
-              <w:right w:type="dxa" w:w="120"/>
-            </w:tcMar>
-            <w:vAlign w:val="top"/>
-          </w:tcPr>
-          <w:p>
-            <w:pPr>
-              <w:spacing w:after="0"/>
-              <w:jc w:val="center"/>
-            </w:pPr>
-            <w:r>
-              <w:rPr>
-                <w:rFonts w:ascii="Calibri" w:cs="Calibri" w:eastAsia="Calibri" w:hAnsi="Calibri"/>
-                <w:b w:val="false"/>
-                <w:bCs w:val="false"/>
-                <w:color w:val="2A2E3A"/>
-                <w:sz w:val="18"/>
-                <w:szCs w:val="18"/>
-              </w:rPr>
-              <w:t xml:space="preserve">Signals: 1</w:t>
-            </w:r>
-          </w:p>
-        </w:tc>
-      </w:tr>
-    </w:tbl>
-    <w:p>
-      <w:pPr>
-        <w:spacing w:after="60" w:before="160"/>
-      </w:pPr>
-      <w:r>
-        <w:rPr>
-          <w:rFonts w:ascii="Calibri" w:cs="Calibri" w:eastAsia="Calibri" w:hAnsi="Calibri"/>
-          <w:b/>
-          <w:bCs/>
-          <w:color w:val="0E1E3F"/>
-          <w:sz w:val="20"/>
-          <w:szCs w:val="20"/>
-        </w:rPr>
-        <w:t xml:space="preserve">Sectors: </w:t>
-      </w:r>
-      <w:r>
-        <w:rPr>
-          <w:rFonts w:ascii="Calibri" w:cs="Calibri" w:eastAsia="Calibri" w:hAnsi="Calibri"/>
-          <w:color w:val="4A4D57"/>
-          <w:sz w:val="20"/>
-          <w:szCs w:val="20"/>
-        </w:rPr>
-        <w:t xml:space="preserve">Logistics, Real Estate, Energy</w:t>
-      </w:r>
-    </w:p>
-    <w:p>
-      <w:pPr>
-        <w:spacing w:after="60"/>
-      </w:pPr>
-      <w:r>
-        <w:rPr>
-          <w:rFonts w:ascii="Calibri" w:cs="Calibri" w:eastAsia="Calibri" w:hAnsi="Calibri"/>
-          <w:b/>
-          <w:bCs/>
-          <w:color w:val="0E1E3F"/>
-          <w:sz w:val="20"/>
-          <w:szCs w:val="20"/>
-        </w:rPr>
-        <w:t xml:space="preserve">Headquarters: </w:t>
-      </w:r>
-      <w:r>
-        <w:rPr>
-          <w:rFonts w:ascii="Calibri" w:cs="Calibri" w:eastAsia="Calibri" w:hAnsi="Calibri"/>
-          <w:color w:val="4A4D57"/>
-          <w:sz w:val="20"/>
-          <w:szCs w:val="20"/>
-        </w:rPr>
-        <w:t xml:space="preserve">United Arab Emirates</w:t>
-      </w:r>
-    </w:p>
-    <w:p>
-      <w:pPr>
-        <w:spacing w:after="80" w:before="160"/>
-      </w:pPr>
-      <w:r>
-        <w:rPr>
-          <w:rFonts w:ascii="Calibri" w:cs="Calibri" w:eastAsia="Calibri" w:hAnsi="Calibri"/>
-          <w:b/>
-          <w:bCs/>
-          <w:color w:val="8C6B3D"/>
-          <w:spacing w:val="40"/>
-          <w:sz w:val="20"/>
-          <w:szCs w:val="20"/>
-        </w:rPr>
-        <w:t xml:space="preserve">Detected signals</w:t>
-      </w:r>
-    </w:p>
-    <w:tbl>
-      <w:tblPr>
-        <w:tblW w:type="dxa" w:w="9360"/>
-        <w:tblBorders>
-          <w:top w:val="single" w:color="auto" w:sz="4"/>
-          <w:left w:val="single" w:color="auto" w:sz="4"/>
-          <w:bottom w:val="single" w:color="auto" w:sz="4"/>
-          <w:right w:val="single" w:color="auto" w:sz="4"/>
-          <w:insideH w:val="single" w:color="auto" w:sz="4"/>
-          <w:insideV w:val="single" w:color="auto" w:sz="4"/>
-        </w:tblBorders>
-      </w:tblPr>
-      <w:tblGrid>
-        <w:gridCol w:w="1400"/>
-        <w:gridCol w:w="1200"/>
-        <w:gridCol w:w="4400"/>
-        <w:gridCol w:w="2360"/>
-      </w:tblGrid>
-      <w:tr>
-        <w:trPr>
-          <w:tblHeader/>
-        </w:trPr>
-        <w:tc>
-          <w:tcPr>
-            <w:tcW w:type="dxa" w:w="1400"/>
-            <w:tcBorders>
-              <w:top w:val="single" w:color="D5D3C8" w:sz="4"/>
-              <w:left w:val="single" w:color="D5D3C8" w:sz="4"/>
-              <w:bottom w:val="single" w:color="D5D3C8" w:sz="4"/>
-              <w:right w:val="single" w:color="D5D3C8" w:sz="4"/>
-            </w:tcBorders>
-            <w:shd w:fill="0E1E3F" w:color="auto" w:val="clear"/>
-            <w:tcMar>
-              <w:top w:type="dxa" w:w="80"/>
-              <w:left w:type="dxa" w:w="120"/>
-              <w:bottom w:type="dxa" w:w="80"/>
-              <w:right w:type="dxa" w:w="120"/>
-            </w:tcMar>
-            <w:vAlign w:val="top"/>
-          </w:tcPr>
-          <w:p>
-            <w:pPr>
-              <w:spacing w:after="0"/>
-              <w:jc w:val="left"/>
-            </w:pPr>
-            <w:r>
-              <w:rPr>
-                <w:rFonts w:ascii="Calibri" w:cs="Calibri" w:eastAsia="Calibri" w:hAnsi="Calibri"/>
-                <w:b/>
-                <w:bCs/>
-                <w:color w:val="FFFFFF"/>
-                <w:sz w:val="18"/>
-                <w:szCs w:val="18"/>
-              </w:rPr>
-              <w:t xml:space="preserve">Type</w:t>
-            </w:r>
-          </w:p>
-        </w:tc>
-        <w:tc>
-          <w:tcPr>
-            <w:tcW w:type="dxa" w:w="1200"/>
-            <w:tcBorders>
-              <w:top w:val="single" w:color="D5D3C8" w:sz="4"/>
-              <w:left w:val="single" w:color="D5D3C8" w:sz="4"/>
-              <w:bottom w:val="single" w:color="D5D3C8" w:sz="4"/>
-              <w:right w:val="single" w:color="D5D3C8" w:sz="4"/>
-            </w:tcBorders>
-            <w:shd w:fill="0E1E3F" w:color="auto" w:val="clear"/>
-            <w:tcMar>
-              <w:top w:type="dxa" w:w="80"/>
-              <w:left w:type="dxa" w:w="120"/>
-              <w:bottom w:type="dxa" w:w="80"/>
-              <w:right w:type="dxa" w:w="120"/>
-            </w:tcMar>
-            <w:vAlign w:val="top"/>
-          </w:tcPr>
-          <w:p>
-            <w:pPr>
-              <w:spacing w:after="0"/>
-              <w:jc w:val="center"/>
-            </w:pPr>
-            <w:r>
-              <w:rPr>
-                <w:rFonts w:ascii="Calibri" w:cs="Calibri" w:eastAsia="Calibri" w:hAnsi="Calibri"/>
-                <w:b/>
-                <w:bCs/>
-                <w:color w:val="FFFFFF"/>
-                <w:sz w:val="18"/>
-                <w:szCs w:val="18"/>
-              </w:rPr>
-              <w:t xml:space="preserve">Strength</w:t>
-            </w:r>
-          </w:p>
-        </w:tc>
-        <w:tc>
-          <w:tcPr>
-            <w:tcW w:type="dxa" w:w="4400"/>
-            <w:tcBorders>
-              <w:top w:val="single" w:color="D5D3C8" w:sz="4"/>
-              <w:left w:val="single" w:color="D5D3C8" w:sz="4"/>
-              <w:bottom w:val="single" w:color="D5D3C8" w:sz="4"/>
-              <w:right w:val="single" w:color="D5D3C8" w:sz="4"/>
-            </w:tcBorders>
-            <w:shd w:fill="0E1E3F" w:color="auto" w:val="clear"/>
-            <w:tcMar>
-              <w:top w:type="dxa" w:w="80"/>
-              <w:left w:type="dxa" w:w="120"/>
-              <w:bottom w:type="dxa" w:w="80"/>
-              <w:right w:type="dxa" w:w="120"/>
-            </w:tcMar>
-            <w:vAlign w:val="top"/>
-          </w:tcPr>
-          <w:p>
-            <w:pPr>
-              <w:spacing w:after="0"/>
-              <w:jc w:val="left"/>
-            </w:pPr>
-            <w:r>
-              <w:rPr>
-                <w:rFonts w:ascii="Calibri" w:cs="Calibri" w:eastAsia="Calibri" w:hAnsi="Calibri"/>
-                <w:b/>
-                <w:bCs/>
-                <w:color w:val="FFFFFF"/>
-                <w:sz w:val="18"/>
-                <w:szCs w:val="18"/>
-              </w:rPr>
-              <w:t xml:space="preserve">Headline</w:t>
-            </w:r>
-          </w:p>
-        </w:tc>
-        <w:tc>
-          <w:tcPr>
-            <w:tcW w:type="dxa" w:w="2360"/>
-            <w:tcBorders>
-              <w:top w:val="single" w:color="D5D3C8" w:sz="4"/>
-              <w:left w:val="single" w:color="D5D3C8" w:sz="4"/>
-              <w:bottom w:val="single" w:color="D5D3C8" w:sz="4"/>
-              <w:right w:val="single" w:color="D5D3C8" w:sz="4"/>
-            </w:tcBorders>
-            <w:shd w:fill="0E1E3F" w:color="auto" w:val="clear"/>
-            <w:tcMar>
-              <w:top w:type="dxa" w:w="80"/>
-              <w:left w:type="dxa" w:w="120"/>
-              <w:bottom w:type="dxa" w:w="80"/>
-              <w:right w:type="dxa" w:w="120"/>
-            </w:tcMar>
-            <w:vAlign w:val="top"/>
-          </w:tcPr>
-          <w:p>
-            <w:pPr>
-              <w:spacing w:after="0"/>
-              <w:jc w:val="left"/>
-            </w:pPr>
-            <w:r>
-              <w:rPr>
-                <w:rFonts w:ascii="Calibri" w:cs="Calibri" w:eastAsia="Calibri" w:hAnsi="Calibri"/>
-                <w:b/>
-                <w:bCs/>
-                <w:color w:val="FFFFFF"/>
-                <w:sz w:val="18"/>
-                <w:szCs w:val="18"/>
-              </w:rPr>
-              <w:t xml:space="preserve">Source</w:t>
-            </w:r>
-          </w:p>
-        </w:tc>
-      </w:tr>
-      <w:tr>
-        <w:tc>
-          <w:tcPr>
-            <w:tcW w:type="dxa" w:w="1400"/>
-            <w:tcBorders>
-              <w:top w:val="single" w:color="D5D3C8" w:sz="4"/>
-              <w:left w:val="single" w:color="D5D3C8" w:sz="4"/>
-              <w:bottom w:val="single" w:color="D5D3C8" w:sz="4"/>
-              <w:right w:val="single" w:color="D5D3C8" w:sz="4"/>
-            </w:tcBorders>
-            <w:tcMar>
-              <w:top w:type="dxa" w:w="80"/>
-              <w:left w:type="dxa" w:w="120"/>
-              <w:bottom w:type="dxa" w:w="80"/>
-              <w:right w:type="dxa" w:w="120"/>
-            </w:tcMar>
-            <w:vAlign w:val="top"/>
-          </w:tcPr>
-          <w:p>
-            <w:pPr>
-              <w:spacing w:after="0"/>
-              <w:jc w:val="left"/>
-            </w:pPr>
-            <w:r>
-              <w:rPr>
-                <w:rFonts w:ascii="Calibri" w:cs="Calibri" w:eastAsia="Calibri" w:hAnsi="Calibri"/>
-                <w:b w:val="false"/>
-                <w:bCs w:val="false"/>
-                <w:color w:val="2A2E3A"/>
-                <w:sz w:val="18"/>
-                <w:szCs w:val="18"/>
-              </w:rPr>
-              <w:t xml:space="preserve">Launch</w:t>
-            </w:r>
-          </w:p>
-        </w:tc>
-        <w:tc>
-          <w:tcPr>
-            <w:tcW w:type="dxa" w:w="1200"/>
-            <w:tcBorders>
-              <w:top w:val="single" w:color="D5D3C8" w:sz="4"/>
-              <w:left w:val="single" w:color="D5D3C8" w:sz="4"/>
-              <w:bottom w:val="single" w:color="D5D3C8" w:sz="4"/>
-              <w:right w:val="single" w:color="D5D3C8" w:sz="4"/>
-            </w:tcBorders>
-            <w:tcMar>
-              <w:top w:type="dxa" w:w="80"/>
-              <w:left w:type="dxa" w:w="120"/>
-              <w:bottom w:type="dxa" w:w="80"/>
-              <w:right w:type="dxa" w:w="120"/>
-            </w:tcMar>
-            <w:vAlign w:val="top"/>
-          </w:tcPr>
-          <w:p>
-            <w:pPr>
-              <w:spacing w:after="0"/>
-              <w:jc w:val="center"/>
-            </w:pPr>
-            <w:r>
-              <w:rPr>
-                <w:rFonts w:ascii="Calibri" w:cs="Calibri" w:eastAsia="Calibri" w:hAnsi="Calibri"/>
-                <w:b w:val="false"/>
-                <w:bCs w:val="false"/>
-                <w:color w:val="2A2E3A"/>
-                <w:sz w:val="18"/>
-                <w:szCs w:val="18"/>
-              </w:rPr>
-              <w:t xml:space="preserve">High</w:t>
-            </w:r>
-          </w:p>
-        </w:tc>
-        <w:tc>
-          <w:tcPr>
-            <w:tcW w:type="dxa" w:w="4400"/>
-            <w:tcBorders>
-              <w:top w:val="single" w:color="D5D3C8" w:sz="4"/>
-              <w:left w:val="single" w:color="D5D3C8" w:sz="4"/>
-              <w:bottom w:val="single" w:color="D5D3C8" w:sz="4"/>
-              <w:right w:val="single" w:color="D5D3C8" w:sz="4"/>
-            </w:tcBorders>
-            <w:tcMar>
-              <w:top w:type="dxa" w:w="80"/>
-              <w:left w:type="dxa" w:w="120"/>
-              <w:bottom w:type="dxa" w:w="80"/>
-              <w:right w:type="dxa" w:w="120"/>
-            </w:tcMar>
-            <w:vAlign w:val="top"/>
-          </w:tcPr>
-          <w:p>
-            <w:pPr>
-              <w:spacing w:after="0"/>
-              <w:jc w:val="left"/>
-            </w:pPr>
-            <w:r>
-              <w:rPr>
-                <w:rFonts w:ascii="Calibri" w:cs="Calibri" w:eastAsia="Calibri" w:hAnsi="Calibri"/>
-                <w:b w:val="false"/>
-                <w:bCs w:val="false"/>
-                <w:color w:val="2A2E3A"/>
-                <w:sz w:val="18"/>
-                <w:szCs w:val="18"/>
-              </w:rPr>
-              <w:t xml:space="preserve">UAE accelerates 2026 infrastructure projects: Energy, water, transport, roads, urban development nationwide</w:t>
-            </w:r>
-          </w:p>
-        </w:tc>
-        <w:tc>
-          <w:tcPr>
-            <w:tcW w:type="dxa" w:w="2360"/>
-            <w:tcBorders>
-              <w:top w:val="single" w:color="D5D3C8" w:sz="4"/>
-              <w:left w:val="single" w:color="D5D3C8" w:sz="4"/>
-              <w:bottom w:val="single" w:color="D5D3C8" w:sz="4"/>
-              <w:right w:val="single" w:color="D5D3C8" w:sz="4"/>
-            </w:tcBorders>
-            <w:tcMar>
-              <w:top w:type="dxa" w:w="80"/>
-              <w:left w:type="dxa" w:w="120"/>
-              <w:bottom w:type="dxa" w:w="80"/>
-              <w:right w:type="dxa" w:w="120"/>
-            </w:tcMar>
-            <w:vAlign w:val="top"/>
-          </w:tcPr>
-          <w:p>
-            <w:pPr>
-              <w:spacing w:after="0"/>
-              <w:jc w:val="left"/>
-            </w:pPr>
-            <w:r>
-              <w:rPr>
-                <w:rFonts w:ascii="Calibri" w:cs="Calibri" w:eastAsia="Calibri" w:hAnsi="Calibri"/>
-                <w:b w:val="false"/>
-                <w:bCs w:val="false"/>
-                <w:color w:val="2A2E3A"/>
-                <w:sz w:val="18"/>
-                <w:szCs w:val="18"/>
-              </w:rPr>
-              <w:t xml:space="preserve">Economy Middle East</w:t>
-            </w:r>
-          </w:p>
-          <w:p>
-            <w:pPr>
-              <w:spacing w:after="0"/>
-              <w:jc w:val="left"/>
-            </w:pPr>
-            <w:r>
-              <w:rPr>
-                <w:rFonts w:ascii="Calibri" w:cs="Calibri" w:eastAsia="Calibri" w:hAnsi="Calibri"/>
-                <w:b w:val="false"/>
-                <w:bCs w:val="false"/>
-                <w:color w:val="2A2E3A"/>
-                <w:sz w:val="18"/>
-                <w:szCs w:val="18"/>
-              </w:rPr>
-              <w:t xml:space="preserve">https://economymiddleeast.com/news/uae-accelerates-2026-inf…</w:t>
-            </w:r>
-          </w:p>
-        </w:tc>
-      </w:tr>
-    </w:tbl>
-    <w:p>
-      <w:pPr>
-        <w:pStyle w:val="Heading3"/>
-        <w:keepNext/>
-        <w:spacing w:after="80" w:before="300"/>
-      </w:pPr>
-      <w:r>
-        <w:rPr>
-          <w:rFonts w:ascii="Calibri" w:cs="Calibri" w:eastAsia="Calibri" w:hAnsi="Calibri"/>
-          <w:b/>
-          <w:bCs/>
-          <w:color w:val="0E1E3F"/>
-          <w:sz w:val="24"/>
-          <w:szCs w:val="24"/>
-        </w:rPr>
-        <w:t xml:space="preserve">16. ElGoat</w:t>
+        <w:t xml:space="preserve">15. ElGoat</w:t>
       </w:r>
     </w:p>
     <w:tbl>
@@ -13509,7 +12719,7 @@
           <w:sz w:val="24"/>
           <w:szCs w:val="24"/>
         </w:rPr>
-        <w:t xml:space="preserve">17. Frimex</w:t>
+        <w:t xml:space="preserve">16. Frimex</w:t>
       </w:r>
     </w:p>
     <w:tbl>
@@ -14086,7 +13296,7 @@
           <w:sz w:val="24"/>
           <w:szCs w:val="24"/>
         </w:rPr>
-        <w:t xml:space="preserve">18. Maison Safqa</w:t>
+        <w:t xml:space="preserve">17. Maison Safqa</w:t>
       </w:r>
     </w:p>
     <w:tbl>

</xml_diff>